<commit_message>
MOO-177: cite MOO-194 as the home of the struck 63-day counterfactual at C22 precision 2, the Section 4 ban and the disposition banner
Co-Authored-By: Claude Opus 5 <noreply@anthropic.com>
</commit_message>
<xml_diff>
--- a/moo172-risk-items.docx
+++ b/moo172-risk-items.docx
@@ -360,7 +360,19 @@
         <w:rPr>
           <w:i/>
         </w:rPr>
-        <w:t xml:space="preserve"> and is commissioned to the Drafting Specialist to re-derive or retire for good. </w:t>
+        <w:t xml:space="preserve"> and is commissioned to the Drafting Specialist at </w:t>
+      </w:r>
+      <w:r>
+        <w:rPr>
+          <w:i/>
+        </w:rPr>
+        <w:t>MOO-194</w:t>
+      </w:r>
+      <w:r>
+        <w:rPr>
+          <w:i/>
+        </w:rPr>
+        <w:t xml:space="preserve"> — re-derive at 120 days or retire for good, one of the two. </w:t>
       </w:r>
       <w:r>
         <w:rPr>
@@ -372,7 +384,7 @@
         <w:rPr>
           <w:i/>
         </w:rPr>
-        <w:t xml:space="preserve"> (§4).</w:t>
+        <w:t xml:space="preserve"> (§4, C22 precision 2).</w:t>
       </w:r>
     </w:p>
     <w:p>
@@ -5056,7 +5068,22 @@
         <w:t>I did not recalculate it: a rejected alternative is re-priced by its author or not at all.</w:t>
       </w:r>
       <w:r>
-        <w:t xml:space="preserve"> Owner: Drafting Specialist.</w:t>
+        <w:t xml:space="preserve"> Owner: Drafting Specialist. </w:t>
+      </w:r>
+      <w:r>
+        <w:rPr>
+          <w:b/>
+        </w:rPr>
+        <w:t>Commissioned by the Policy Director at [MOO-194](/MOO/issues/MOO-194), 12 October 2026</w:t>
+      </w:r>
+      <w:r>
+        <w:t xml:space="preserve"> — re-derive at 120 days or retire for good, one of the two. </w:t>
+      </w:r>
+      <w:r>
+        <w:rPr>
+          <w:b/>
+        </w:rPr>
+        <w:t>Until that closes the figure stays struck and the proposition stands without a number.</w:t>
       </w:r>
     </w:p>
     <w:p>
@@ -7295,7 +7322,31 @@
         <w:t xml:space="preserve"> and </w:t>
       </w:r>
       <w:r>
-        <w:t>+698 characters**.</w:t>
+        <w:t>+698 characters</w:t>
+      </w:r>
+      <w:r>
+        <w:rPr>
+          <w:b/>
+        </w:rPr>
+        <w:t xml:space="preserve">. </w:t>
+      </w:r>
+      <w:r>
+        <w:t xml:space="preserve">The 63-day ban holds until </w:t>
+      </w:r>
+      <w:r>
+        <w:t>MOO-194</w:t>
+      </w:r>
+      <w:r>
+        <w:t xml:space="preserve"> closes</w:t>
+      </w:r>
+      <w:r>
+        <w:rPr>
+          <w:b/>
+        </w:rPr>
+        <w:t xml:space="preserve">, and it becomes permanent if that issue retires the figure rather than replacing it. </w:t>
+      </w:r>
+      <w:r>
+        <w:t>The other three bans are permanent now.**</w:t>
       </w:r>
     </w:p>
     <w:p>

</xml_diff>

<commit_message>
MOO-194: the 63-day counterfactual is retired for good — four register sites applied, the ban made permanent and C22 precision 2 closed
Board accepted the retirement at 18:14 on 12 October 2026 (confirmation card bound to
moo194-counterfactual-disposition revision 11a2eb27). At 120 days the quantity the figure
measured does not exist on any facts M 2 permits, so there is nothing to re-price.

- header disposition box item 4 — struck and closed
- Sec. 1 arithmetic table, the 63 days row — RETIRED PERMANENTLY, closed by its author
- C22 precision 2 — replaced in full and closed rather than held
- Sec. 4 four-figure ban bullet — the 63-day ban permanent; all four bans now permanent

No figure replaces it. No new finding. No fiscal change: $0, carried by MOO-163.
Revision 6 untouched. Internal working draft; not reviewed by counsel or by DLS.

Co-Authored-By: Claude Opus 5 <noreply@anthropic.com>
</commit_message>
<xml_diff>
--- a/moo172-risk-items.docx
+++ b/moo172-risk-items.docx
@@ -352,39 +352,64 @@
       </w:r>
       <w:r>
         <w:rPr>
-          <w:b/>
-        </w:rPr>
-        <w:t>The 63-day counterfactual stays struck</w:t>
-      </w:r>
-      <w:r>
-        <w:rPr>
           <w:i/>
-        </w:rPr>
-        <w:t xml:space="preserve"> and is commissioned to the Drafting Specialist at </w:t>
+          <w:strike/>
+        </w:rPr>
+        <w:t>**The 63-day counterfactual stays struck**</w:t>
       </w:r>
       <w:r>
         <w:rPr>
           <w:i/>
         </w:rPr>
+        <w:t xml:space="preserve"> — </w:t>
+      </w:r>
+      <w:r>
+        <w:rPr>
+          <w:b/>
+        </w:rPr>
+        <w:t>STRUCK, AND NOW CLOSED.</w:t>
+      </w:r>
+      <w:r>
+        <w:rPr>
+          <w:i/>
+        </w:rPr>
+        <w:t xml:space="preserve"> The Drafting Specialist retired it for good at </w:t>
+      </w:r>
+      <w:r>
+        <w:rPr>
+          <w:i/>
+        </w:rPr>
         <w:t>MOO-194</w:t>
       </w:r>
       <w:r>
         <w:rPr>
           <w:i/>
         </w:rPr>
-        <w:t xml:space="preserve"> — re-derive at 120 days or retire for good, one of the two. </w:t>
-      </w:r>
-      <w:r>
-        <w:rPr>
-          <w:b/>
-        </w:rPr>
-        <w:t>It is not restated in any artifact meanwhile</w:t>
+        <w:t xml:space="preserve"> on 12 October 2026: at 120 days the gap it measured does not exist on any facts M 2 permits, the figure is </w:t>
+      </w:r>
+      <w:r>
+        <w:rPr>
+          <w:b/>
+        </w:rPr>
+        <w:t>not</w:t>
       </w:r>
       <w:r>
         <w:rPr>
           <w:i/>
         </w:rPr>
-        <w:t xml:space="preserve"> (§4, C22 precision 2).</w:t>
+        <w:t xml:space="preserve"> replaced, and the reason Edit 1's deletion was kept stands without a number. </w:t>
+      </w:r>
+      <w:r>
+        <w:rPr>
+          <w:b/>
+        </w:rPr>
+        <w:t>The ban on restating it is permanent</w:t>
+      </w:r>
+      <w:r>
+        <w:rPr>
+          <w:i/>
+        </w:rPr>
+        <w:t xml:space="preserve"> (§4; C22 precision 2, closed).</w:t>
       </w:r>
     </w:p>
     <w:p>
@@ -2279,25 +2304,25 @@
               <w:rPr>
                 <w:b/>
               </w:rPr>
-              <w:t>RETIRED as a figure.</w:t>
+              <w:t>RETIRED PERMANENTLY — closed by its author at [MOO-194](/MOO/issues/MOO-194), 12 October 2026. Not re-derived, and it will not be:</w:t>
             </w:r>
             <w:r>
-              <w:t xml:space="preserve"> It was revision 5's counterfactual on a retention ending day 37 and it has </w:t>
+              <w:t xml:space="preserve"> at 120 days the quantity it measured does not exist on any facts M 2 permits. See C22 precision 2, </w:t>
             </w:r>
             <w:r>
               <w:rPr>
                 <w:b/>
               </w:rPr>
-              <w:t>not</w:t>
+              <w:t>now closed</w:t>
             </w:r>
             <w:r>
-              <w:t xml:space="preserve"> been re-derived at 120 days by its author. See C22 precision 2 — </w:t>
+              <w:t xml:space="preserve"> — </w:t>
             </w:r>
             <w:r>
               <w:rPr>
                 <w:b/>
               </w:rPr>
-              <w:t>the reason the deletion was kept survives; the number does not</w:t>
+              <w:t>the reason the deletion was kept survives, and it is not a number</w:t>
             </w:r>
           </w:p>
         </w:tc>
@@ -5030,60 +5055,132 @@
         <w:pStyle w:val="ListNumber"/>
       </w:pPr>
       <w:r>
-        <w:rPr>
-          <w:b/>
-        </w:rPr>
-        <w:t>The 63-day counterfactual is retired as a figure and must not be restated.</w:t>
-      </w:r>
-      <w:r>
-        <w:t xml:space="preserve"> It was 100 − 37 on a</w:t>
+        <w:t>**The 63-day counterfactual is retired for good and must never be restated. CLOSED by its author at</w:t>
       </w:r>
     </w:p>
     <w:p>
       <w:r>
-        <w:t xml:space="preserve">retention ending day 37 and on the undeleted reading, and </w:t>
-      </w:r>
-      <w:r>
-        <w:rPr>
-          <w:b/>
-        </w:rPr>
-        <w:t>its author has not re-derived it at 120 days.</w:t>
-      </w:r>
-      <w:r>
-        <w:t xml:space="preserve"> What survives is the proposition it was evidence for — </w:t>
-      </w:r>
-      <w:r>
-        <w:rPr>
-          <w:b/>
-        </w:rPr>
-        <w:t>that is why Edit 1's three-word deletion was kept</w:t>
-      </w:r>
-      <w:r>
-        <w:t xml:space="preserve"> (revision 5 §5.3, undisturbed by revision 6) — and that proposition is stated without the number. </w:t>
-      </w:r>
-      <w:r>
-        <w:rPr>
-          <w:b/>
-        </w:rPr>
-        <w:t>I did not recalculate it: a rejected alternative is re-priced by its author or not at all.</w:t>
-      </w:r>
-      <w:r>
-        <w:t xml:space="preserve"> Owner: Drafting Specialist. </w:t>
-      </w:r>
-      <w:r>
-        <w:rPr>
-          <w:b/>
-        </w:rPr>
-        <w:t>Commissioned by the Policy Director at [MOO-194](/MOO/issues/MOO-194), 12 October 2026</w:t>
-      </w:r>
-      <w:r>
-        <w:t xml:space="preserve"> — re-derive at 120 days or retire for good, one of the two. </w:t>
-      </w:r>
-      <w:r>
-        <w:rPr>
-          <w:b/>
-        </w:rPr>
-        <w:t>Until that closes the figure stays struck and the proposition stands without a number.</w:t>
+        <w:t>MOO-194</w:t>
+      </w:r>
+      <w:r>
+        <w:t>, 12 October 2026 — retired, not replaced.</w:t>
+      </w:r>
+      <w:r>
+        <w:rPr>
+          <w:b/>
+        </w:rPr>
+        <w:t xml:space="preserve"> It was 100 − 37: the </w:t>
+      </w:r>
+      <w:r>
+        <w:t>size of the self-defeat gap</w:t>
+      </w:r>
+      <w:r>
+        <w:rPr>
+          <w:b/>
+        </w:rPr>
+        <w:t xml:space="preserve"> the </w:t>
+      </w:r>
+      <w:r>
+        <w:t>undeleted</w:t>
+      </w:r>
+      <w:r>
+        <w:rPr>
+          <w:b/>
+        </w:rPr>
+        <w:t xml:space="preserve"> reading of Edit 1's saving clause would have left, the application duty at </w:t>
+      </w:r>
+      <w:r>
+        <w:t>D + 15</w:t>
+      </w:r>
+      <w:r>
+        <w:rPr>
+          <w:b/>
+        </w:rPr>
+        <w:t xml:space="preserve"> against a retention ending </w:t>
+      </w:r>
+      <w:r>
+        <w:t>F + 30</w:t>
+      </w:r>
+      <w:r>
+        <w:rPr>
+          <w:b/>
+        </w:rPr>
+        <w:t xml:space="preserve"> (revision 5 §5.3). </w:t>
+      </w:r>
+      <w:r>
+        <w:t>At 120 days that quantity does not exist.</w:t>
+      </w:r>
+      <w:r>
+        <w:rPr>
+          <w:b/>
+        </w:rPr>
+        <w:t xml:space="preserve"> The retention ends </w:t>
+      </w:r>
+      <w:r>
+        <w:t>F + 120</w:t>
+      </w:r>
+      <w:r>
+        <w:rPr>
+          <w:b/>
+        </w:rPr>
+        <w:t xml:space="preserve">, the undeleted reading's duty still falls at </w:t>
+      </w:r>
+      <w:r>
+        <w:t>D + 15</w:t>
+      </w:r>
+      <w:r>
+        <w:rPr>
+          <w:b/>
+        </w:rPr>
+        <w:t xml:space="preserve">, and a gap would need </w:t>
+      </w:r>
+      <w:r>
+        <w:t>D − F &gt; 105</w:t>
+      </w:r>
+      <w:r>
+        <w:rPr>
+          <w:b/>
+        </w:rPr>
+        <w:t xml:space="preserve"> — which no facts M 2 permits allow, since M 2 gives the Board 90 days to act upon a request, so </w:t>
+      </w:r>
+      <w:r>
+        <w:t>D − F ≤ 90</w:t>
+      </w:r>
+      <w:r>
+        <w:rPr>
+          <w:b/>
+        </w:rPr>
+        <w:t xml:space="preserve"> on every admissible set of facts. </w:t>
+      </w:r>
+      <w:r>
+        <w:t>There is no gap to measure on any facts M 2 permits, so there is no figure to re-derive</w:t>
+      </w:r>
+      <w:r>
+        <w:rPr>
+          <w:b/>
+        </w:rPr>
+        <w:t xml:space="preserve">, and a margin is a quantity of the opposite sign that could not carry the proposition this figure was offered for. </w:t>
+      </w:r>
+      <w:r>
+        <w:t>The author does not replace it.</w:t>
+      </w:r>
+      <w:r>
+        <w:rPr>
+          <w:b/>
+        </w:rPr>
+        <w:t xml:space="preserve"> What survives is the reason the deletion was kept, and that reason is not a quantity: </w:t>
+      </w:r>
+      <w:r>
+        <w:t>one sentence cannot carry two meanings of one phrase.</w:t>
+      </w:r>
+      <w:r>
+        <w:rPr>
+          <w:b/>
+        </w:rPr>
+        <w:t xml:space="preserve"> The approved form of words is [MOO-194](/MOO/issues/MOO-194) §4. </w:t>
+      </w:r>
+      <w:r>
+        <w:t>The §4 ban on 63 is permanent from today, and this precision is closed rather than held.**</w:t>
       </w:r>
     </w:p>
     <w:p>
@@ -7331,22 +7428,25 @@
         <w:t xml:space="preserve">. </w:t>
       </w:r>
       <w:r>
-        <w:t xml:space="preserve">The 63-day ban holds until </w:t>
-      </w:r>
-      <w:r>
-        <w:t>MOO-194</w:t>
-      </w:r>
-      <w:r>
-        <w:t xml:space="preserve"> closes</w:t>
-      </w:r>
-      <w:r>
-        <w:rPr>
-          <w:b/>
-        </w:rPr>
-        <w:t xml:space="preserve">, and it becomes permanent if that issue retires the figure rather than replacing it. </w:t>
-      </w:r>
-      <w:r>
-        <w:t>The other three bans are permanent now.**</w:t>
+        <w:t>The 63-day ban is permanent from 12 October 2026:</w:t>
+      </w:r>
+      <w:r>
+        <w:rPr>
+          <w:b/>
+        </w:rPr>
+        <w:t xml:space="preserve"> [MOO-194](/MOO/issues/MOO-194) closed with the figure </w:t>
+      </w:r>
+      <w:r>
+        <w:t>retired for good and not replaced</w:t>
+      </w:r>
+      <w:r>
+        <w:rPr>
+          <w:b/>
+        </w:rPr>
+        <w:t xml:space="preserve">, so there is no successor figure and none is coming. </w:t>
+      </w:r>
+      <w:r>
+        <w:t>All four bans are now permanent.**</w:t>
       </w:r>
     </w:p>
     <w:p>

</xml_diff>

<commit_message>
MOO-194: hold C22 precision 2 to the accepted words - drop one clause I had added beyond the approved Site 2 text
The approved text at moo194-counterfactual-disposition revision 11a2eb27 stops at
"M 2 gives the Board 90 days to act upon a request". The D - F <= 90 restatement I
had added is the same derivation but it was not in the accepted words, so it comes out.

Co-Authored-By: Claude Opus 5 <noreply@anthropic.com>
</commit_message>
<xml_diff>
--- a/moo172-risk-items.docx
+++ b/moo172-risk-items.docx
@@ -5141,16 +5141,7 @@
         <w:rPr>
           <w:b/>
         </w:rPr>
-        <w:t xml:space="preserve"> — which no facts M 2 permits allow, since M 2 gives the Board 90 days to act upon a request, so </w:t>
-      </w:r>
-      <w:r>
-        <w:t>D − F ≤ 90</w:t>
-      </w:r>
-      <w:r>
-        <w:rPr>
-          <w:b/>
-        </w:rPr>
-        <w:t xml:space="preserve"> on every admissible set of facts. </w:t>
+        <w:t xml:space="preserve"> — which no facts M 2 permits allow, since M 2 gives the Board 90 days to act upon a request. </w:t>
       </w:r>
       <w:r>
         <w:t>There is no gap to measure on any facts M 2 permits, so there is no figure to re-derive</w:t>

</xml_diff>